<commit_message>
Revise visual-intensity measure to O*NET Abilities (primary) with LLM task share as secondary; add validation section
Co-Authored-By: Claude Sonnet 5.5 <noreply@anthropic.com>
Claude-Session: https://claude.ai/code/session_01H4JvRLBkzRHsy6jU5TcEWv
</commit_message>
<xml_diff>
--- a/isr_paper/ISR_Paper_AI_Vision_Fixed_Costs.docx
+++ b/isr_paper/ISR_Paper_AI_Vision_Fixed_Costs.docx
@@ -83,7 +83,7 @@
           <w:sz w:val="22"/>
           <w:szCs w:val="22"/>
         </w:rPr>
-        <w:t xml:space="preserve">This draft implements the full manuscript structure, theory, hypotheses, measurement and identification strategy of the research proposal. The Lightcast data have not yet been extracted and no model has been estimated. Section 6 therefore contains pre-specified tables with placeholders and no numerical results; no empirical finding is asserted anywhere in this draft. Bibliographic details marked † must be verified before submission.</w:t>
+        <w:t xml:space="preserve">This draft implements the full manuscript structure, theory, hypotheses, measurement and identification strategy of the research proposal. The Lightcast data have not yet been extracted and no model has been estimated; the visual-intensity measure has been constructed and validated (Section 4.3). Section 6 therefore contains pre-specified tables with placeholders and no numerical results; no empirical finding is asserted anywhere in this draft. Bibliographic details marked † must be verified before submission.</w:t>
       </w:r>
     </w:p>
     <w:p>
@@ -118,7 +118,7 @@
           <w:sz w:val="24"/>
           <w:szCs w:val="24"/>
         </w:rPr>
-        <w:t xml:space="preserve">Whether AI vision displaces workers depends less on what the technology can see than on whether automating a visual task covers a largely fixed cost. We develop a break-even model of automation in which a firm adopts computer vision only when its volume of visual tasks exceeds a threshold, and derive four testable predictions: adoption reduces demand for vision-intensive occupations, more so in firms with large visual task volumes; general-purpose vision foundation models lower the break-even scale and extend adoption to smaller firms; and adoption raises demand for complementary judgment, monitoring, and integration skills. We design a test using Lightcast online job postings for the United States, 2015–2025, measuring adoption from firms’ computer-vision skill requirements and occupational visual intensity from O*NET task statements, and using staggered difference-in-differences and an event study around foundation-model releases, while separating vision effects from concurrent large language model effects. The paper moves research on AI and work from technical exposure to the economics of adoption.</w:t>
+        <w:t xml:space="preserve">Whether AI vision displaces workers depends less on what the technology can see than on whether automating a visual task covers a largely fixed cost. We develop a break-even model of automation in which a firm adopts computer vision only when its volume of visual tasks exceeds a threshold, and derive four testable predictions: adoption reduces demand for vision-intensive occupations, more so in firms with large visual task volumes; general-purpose vision foundation models lower the break-even scale and extend adoption to smaller firms; and adoption raises demand for complementary judgment, monitoring, and integration skills. We design a test using Lightcast online job postings for the United States, 2015–2025, measuring adoption from firms’ computer-vision skill requirements and occupational visual intensity from O*NET analyst ratings of visual abilities, and using staggered difference-in-differences and an event study around foundation-model releases, while separating vision effects from concurrent large language model effects. The paper moves research on AI and work from technical exposure to the economics of adoption.</w:t>
       </w:r>
     </w:p>
     <w:p>
@@ -316,7 +316,25 @@
           <w:sz w:val="24"/>
           <w:szCs w:val="24"/>
         </w:rPr>
-        <w:t xml:space="preserve">To answer them, we use Lightcast (formerly Burning Glass Technologies) online job postings for the United States from 2015 to 2025. Postings let us observe, at the firm-quarter level, both what a firm hires for and which technical skills it requires. We infer adoption of computer vision from the skills a firm begins to demand, measure the visual intensity of occupations by classifying O*NET task statements according to their dependence on visual perception, and estimate (i) staggered difference-in-differences effects of adoption on demand for vision-intensive occupations and complementary skills, (ii) heterogeneity of these effects by pre-period task scale, and (iii) an event study around the release of general-purpose vision foundation models, estimated separately by firm size. Because vision foundation models diffused alongside large language models (LLMs), all specifications control for occupational exposure to LLMs.</w:t>
+        <w:t xml:space="preserve">To answer them, we use Lightcast (formerly Burning Glass Technologies) online job postings for the United States from 2015 to 2025. Postings let us observe, at the firm-quarter level, both what a firm hires for and which technical skills it requires. We infer adoption of computer vision from the skills a firm begins to demand, measure the visual intensity of occupations from O</w:t>
+      </w:r>
+      <w:r>
+        <w:rPr>
+          <w:rFonts w:ascii="Times New Roman" w:cs="Times New Roman" w:eastAsia="Times New Roman" w:hAnsi="Times New Roman"/>
+          <w:i/>
+          <w:iCs/>
+          <w:sz w:val="24"/>
+          <w:szCs w:val="24"/>
+        </w:rPr>
+        <w:t xml:space="preserve">NET analyst ratings of visual abilities (with an LLM-based classification of O</w:t>
+      </w:r>
+      <w:r>
+        <w:rPr>
+          <w:rFonts w:ascii="Times New Roman" w:cs="Times New Roman" w:eastAsia="Times New Roman" w:hAnsi="Times New Roman"/>
+          <w:sz w:val="24"/>
+          <w:szCs w:val="24"/>
+        </w:rPr>
+        <w:t xml:space="preserve">NET task statements as a secondary measure), and estimate (i) staggered difference-in-differences effects of adoption on demand for vision-intensive occupations and complementary skills, (ii) heterogeneity of these effects by pre-period task scale, and (iii) an event study around the release of general-purpose vision foundation models, estimated separately by firm size. Because vision foundation models diffused alongside large language models (LLMs), all specifications control for occupational exposure to LLMs.</w:t>
       </w:r>
     </w:p>
     <w:p>
@@ -1595,15 +1613,15 @@
           <w:sz w:val="24"/>
           <w:szCs w:val="24"/>
         </w:rPr>
-        <w:t xml:space="preserve">Visual task intensity</w:t>
-      </w:r>
-      <w:r>
-        <w:rPr>
-          <w:rFonts w:ascii="Times New Roman" w:cs="Times New Roman" w:eastAsia="Times New Roman" w:hAnsi="Times New Roman"/>
-          <w:sz w:val="24"/>
-          <w:szCs w:val="24"/>
-        </w:rPr>
-        <w:t xml:space="preserve"> is the share of an occupation’s O</w:t>
+        <w:t xml:space="preserve">Occupational visual intensity</w:t>
+      </w:r>
+      <w:r>
+        <w:rPr>
+          <w:rFonts w:ascii="Times New Roman" w:cs="Times New Roman" w:eastAsia="Times New Roman" w:hAnsi="Times New Roman"/>
+          <w:sz w:val="24"/>
+          <w:szCs w:val="24"/>
+        </w:rPr>
+        <w:t xml:space="preserve"> is our primary measure, built from the O</w:t>
       </w:r>
       <w:r>
         <w:rPr>
@@ -1613,7 +1631,25 @@
           <w:sz w:val="24"/>
           <w:szCs w:val="24"/>
         </w:rPr>
-        <w:t xml:space="preserve">NET task statements that depend on visual perception or inspection, classified using an LLM-assisted protocol validated against human coders on a random sample. </w:t>
+        <w:t xml:space="preserve">NET Abilities database: the mean importance rating (1–5, rescaled to 0–1) of seven visual abilities (near vision, far vision, visual color discrimination, night vision, peripheral vision, depth perception, glare sensitivity), collapsed from O</w:t>
+      </w:r>
+      <w:r>
+        <w:rPr>
+          <w:rFonts w:ascii="Times New Roman" w:cs="Times New Roman" w:eastAsia="Times New Roman" w:hAnsi="Times New Roman"/>
+          <w:sz w:val="24"/>
+          <w:szCs w:val="24"/>
+        </w:rPr>
+        <w:t xml:space="preserve">NET-SOC to six-digit SOC codes. As a secondary measure, we classify O</w:t>
+      </w:r>
+      <w:r>
+        <w:rPr>
+          <w:rFonts w:ascii="Times New Roman" w:cs="Times New Roman" w:eastAsia="Times New Roman" w:hAnsi="Times New Roman"/>
+          <w:i/>
+          <w:iCs/>
+          <w:sz w:val="24"/>
+          <w:szCs w:val="24"/>
+        </w:rPr>
+        <w:t xml:space="preserve">NET task statements by their dependence on visual perception using a large language model and aggregate the share of visually dependent tasks by occupation. </w:t>
       </w:r>
       <w:r>
         <w:rPr>
@@ -1924,7 +1960,7 @@
                 <w:sz w:val="20"/>
                 <w:szCs w:val="20"/>
               </w:rPr>
-              <w:t xml:space="preserve">Visual task intensity</w:t>
+              <w:t xml:space="preserve">Occupational visual intensity (primary)</w:t>
             </w:r>
           </w:p>
         </w:tc>
@@ -1956,7 +1992,7 @@
                 <w:sz w:val="20"/>
                 <w:szCs w:val="20"/>
               </w:rPr>
-              <w:t xml:space="preserve">Share of each occupation’s O*NET task statements that depend on visual perception or inspection; LLM-assisted classification validated against human coders on a random sample.</w:t>
+              <w:t xml:space="preserve">Mean importance of seven O*NET visual abilities (near/far vision, color discrimination, night/peripheral vision, depth perception, glare sensitivity), rescaled to 0–1; SOC6 level.</w:t>
             </w:r>
           </w:p>
         </w:tc>
@@ -1988,7 +2024,7 @@
                 <w:sz w:val="20"/>
                 <w:szCs w:val="20"/>
               </w:rPr>
-              <w:t xml:space="preserve">O*NET task statements</w:t>
+              <w:t xml:space="preserve">O*NET Abilities</w:t>
             </w:r>
           </w:p>
         </w:tc>
@@ -2026,7 +2062,7 @@
                 <w:sz w:val="20"/>
                 <w:szCs w:val="20"/>
               </w:rPr>
-              <w:t xml:space="preserve">Firm visual exposure (VisExp)</w:t>
+              <w:t xml:space="preserve">Visual task share (secondary)</w:t>
             </w:r>
           </w:p>
         </w:tc>
@@ -2058,7 +2094,7 @@
                 <w:sz w:val="20"/>
                 <w:szCs w:val="20"/>
               </w:rPr>
-              <w:t xml:space="preserve">Posting-weighted average of occupational visual intensity in the pre-period (2015–2018).</w:t>
+              <w:t xml:space="preserve">Share of an occupation’s O*NET task statements that depend on visual perception, classified by an LLM.</w:t>
             </w:r>
           </w:p>
         </w:tc>
@@ -2090,7 +2126,7 @@
                 <w:sz w:val="20"/>
                 <w:szCs w:val="20"/>
               </w:rPr>
-              <w:t xml:space="preserve">Lightcast + O*NET</w:t>
+              <w:t xml:space="preserve">O*NET task statements</w:t>
             </w:r>
           </w:p>
         </w:tc>
@@ -2128,7 +2164,7 @@
                 <w:sz w:val="20"/>
                 <w:szCs w:val="20"/>
               </w:rPr>
-              <w:t xml:space="preserve">Firm language exposure (LangExp)</w:t>
+              <w:t xml:space="preserve">Firm visual exposure (VisExp)</w:t>
             </w:r>
           </w:p>
         </w:tc>
@@ -2160,7 +2196,7 @@
                 <w:sz w:val="20"/>
                 <w:szCs w:val="20"/>
               </w:rPr>
-              <w:t xml:space="preserve">Posting-weighted average of occupational exposure to large language models.</w:t>
+              <w:t xml:space="preserve">Posting-weighted average of primary occupational visual intensity in the pre-period (2015–2018).</w:t>
             </w:r>
           </w:p>
         </w:tc>
@@ -2192,7 +2228,7 @@
                 <w:sz w:val="20"/>
                 <w:szCs w:val="20"/>
               </w:rPr>
-              <w:t xml:space="preserve">Eloundou et al. (2023)</w:t>
+              <w:t xml:space="preserve">Lightcast + O*NET</w:t>
             </w:r>
           </w:p>
         </w:tc>
@@ -2230,7 +2266,7 @@
                 <w:sz w:val="20"/>
                 <w:szCs w:val="20"/>
               </w:rPr>
-              <w:t xml:space="preserve">Task scale</w:t>
+              <w:t xml:space="preserve">Firm language exposure (LangExp)</w:t>
             </w:r>
           </w:p>
         </w:tc>
@@ -2262,7 +2298,7 @@
                 <w:sz w:val="20"/>
                 <w:szCs w:val="20"/>
               </w:rPr>
-              <w:t xml:space="preserve">Pre-period count of postings in vision-intensive occupations; Compustat employment for the matched subsample.</w:t>
+              <w:t xml:space="preserve">Posting-weighted average of occupational exposure to large language models.</w:t>
             </w:r>
           </w:p>
         </w:tc>
@@ -2294,7 +2330,7 @@
                 <w:sz w:val="20"/>
                 <w:szCs w:val="20"/>
               </w:rPr>
-              <w:t xml:space="preserve">Lightcast, Compustat</w:t>
+              <w:t xml:space="preserve">Eloundou et al. (2023)</w:t>
             </w:r>
           </w:p>
         </w:tc>
@@ -2310,6 +2346,108 @@
             <w:tcBorders>
               <w:top w:val="none" w:color="FFFFFF" w:sz="0"/>
               <w:left w:val="none" w:color="FFFFFF" w:sz="0"/>
+              <w:bottom w:val="none" w:color="FFFFFF" w:sz="0"/>
+              <w:right w:val="none" w:color="FFFFFF" w:sz="0"/>
+            </w:tcBorders>
+            <w:tcMar>
+              <w:top w:type="dxa" w:w="50"/>
+              <w:left w:type="dxa" w:w="90"/>
+              <w:bottom w:type="dxa" w:w="50"/>
+              <w:right w:type="dxa" w:w="90"/>
+            </w:tcMar>
+          </w:tcPr>
+          <w:p>
+            <w:pPr>
+              <w:spacing w:line="240" w:lineRule="auto"/>
+            </w:pPr>
+            <w:r>
+              <w:rPr>
+                <w:rFonts w:ascii="Times New Roman" w:cs="Times New Roman" w:eastAsia="Times New Roman" w:hAnsi="Times New Roman"/>
+                <w:b w:val="false"/>
+                <w:bCs w:val="false"/>
+                <w:sz w:val="20"/>
+                <w:szCs w:val="20"/>
+              </w:rPr>
+              <w:t xml:space="preserve">Task scale</w:t>
+            </w:r>
+          </w:p>
+        </w:tc>
+        <w:tc>
+          <w:tcPr>
+            <w:tcW w:type="dxa" w:w="5560"/>
+            <w:tcBorders>
+              <w:top w:val="none" w:color="FFFFFF" w:sz="0"/>
+              <w:left w:val="none" w:color="FFFFFF" w:sz="0"/>
+              <w:bottom w:val="none" w:color="FFFFFF" w:sz="0"/>
+              <w:right w:val="none" w:color="FFFFFF" w:sz="0"/>
+            </w:tcBorders>
+            <w:tcMar>
+              <w:top w:type="dxa" w:w="50"/>
+              <w:left w:type="dxa" w:w="90"/>
+              <w:bottom w:type="dxa" w:w="50"/>
+              <w:right w:type="dxa" w:w="90"/>
+            </w:tcMar>
+          </w:tcPr>
+          <w:p>
+            <w:pPr>
+              <w:spacing w:line="240" w:lineRule="auto"/>
+            </w:pPr>
+            <w:r>
+              <w:rPr>
+                <w:rFonts w:ascii="Times New Roman" w:cs="Times New Roman" w:eastAsia="Times New Roman" w:hAnsi="Times New Roman"/>
+                <w:b w:val="false"/>
+                <w:bCs w:val="false"/>
+                <w:sz w:val="20"/>
+                <w:szCs w:val="20"/>
+              </w:rPr>
+              <w:t xml:space="preserve">Pre-period count of postings in vision-intensive occupations; Compustat employment for the matched subsample.</w:t>
+            </w:r>
+          </w:p>
+        </w:tc>
+        <w:tc>
+          <w:tcPr>
+            <w:tcW w:type="dxa" w:w="2100"/>
+            <w:tcBorders>
+              <w:top w:val="none" w:color="FFFFFF" w:sz="0"/>
+              <w:left w:val="none" w:color="FFFFFF" w:sz="0"/>
+              <w:bottom w:val="none" w:color="FFFFFF" w:sz="0"/>
+              <w:right w:val="none" w:color="FFFFFF" w:sz="0"/>
+            </w:tcBorders>
+            <w:tcMar>
+              <w:top w:type="dxa" w:w="50"/>
+              <w:left w:type="dxa" w:w="90"/>
+              <w:bottom w:type="dxa" w:w="50"/>
+              <w:right w:type="dxa" w:w="90"/>
+            </w:tcMar>
+          </w:tcPr>
+          <w:p>
+            <w:pPr>
+              <w:spacing w:line="240" w:lineRule="auto"/>
+            </w:pPr>
+            <w:r>
+              <w:rPr>
+                <w:rFonts w:ascii="Times New Roman" w:cs="Times New Roman" w:eastAsia="Times New Roman" w:hAnsi="Times New Roman"/>
+                <w:b w:val="false"/>
+                <w:bCs w:val="false"/>
+                <w:sz w:val="20"/>
+                <w:szCs w:val="20"/>
+              </w:rPr>
+              <w:t xml:space="preserve">Lightcast, Compustat</w:t>
+            </w:r>
+          </w:p>
+        </w:tc>
+      </w:tr>
+      <w:tr>
+        <w:trPr>
+          <w:cantSplit/>
+          <w:tblHeader w:val="false"/>
+        </w:trPr>
+        <w:tc>
+          <w:tcPr>
+            <w:tcW w:type="dxa" w:w="1700"/>
+            <w:tcBorders>
+              <w:top w:val="none" w:color="FFFFFF" w:sz="0"/>
+              <w:left w:val="none" w:color="FFFFFF" w:sz="0"/>
               <w:bottom w:val="single" w:color="000000" w:sz="4"/>
               <w:right w:val="none" w:color="FFFFFF" w:sz="0"/>
             </w:tcBorders>
@@ -2411,6 +2549,86 @@
           <w:rFonts w:ascii="Times New Roman" w:cs="Times New Roman" w:eastAsia="Times New Roman" w:hAnsi="Times New Roman"/>
         </w:rPr>
         <w:t xml:space="preserve"/>
+      </w:r>
+    </w:p>
+    <w:p>
+      <w:pPr>
+        <w:pStyle w:val="Heading2"/>
+        <w:keepNext/>
+        <w:spacing w:after="120" w:before="240" w:line="240" w:lineRule="auto"/>
+      </w:pPr>
+      <w:r>
+        <w:rPr>
+          <w:rFonts w:ascii="Times New Roman" w:cs="Times New Roman" w:eastAsia="Times New Roman" w:hAnsi="Times New Roman"/>
+          <w:b/>
+          <w:bCs/>
+          <w:sz w:val="24"/>
+          <w:szCs w:val="24"/>
+        </w:rPr>
+        <w:t xml:space="preserve">4.3 Validation of the Visual-Intensity Measure</w:t>
+      </w:r>
+    </w:p>
+    <w:p>
+      <w:pPr>
+        <w:spacing w:after="0" w:line="480" w:lineRule="auto"/>
+        <w:ind w:firstLine="720"/>
+        <w:jc w:val="left"/>
+      </w:pPr>
+      <w:r>
+        <w:rPr>
+          <w:rFonts w:ascii="Times New Roman" w:cs="Times New Roman" w:eastAsia="Times New Roman" w:hAnsi="Times New Roman"/>
+          <w:sz w:val="24"/>
+          <w:szCs w:val="24"/>
+        </w:rPr>
+        <w:t xml:space="preserve">We validated the measures before using them. The seven O</w:t>
+      </w:r>
+      <w:r>
+        <w:rPr>
+          <w:rFonts w:ascii="Times New Roman" w:cs="Times New Roman" w:eastAsia="Times New Roman" w:hAnsi="Times New Roman"/>
+          <w:i/>
+          <w:iCs/>
+          <w:sz w:val="24"/>
+          <w:szCs w:val="24"/>
+        </w:rPr>
+        <w:t xml:space="preserve">NET visual-ability ratings are internally consistent across the 879 O</w:t>
+      </w:r>
+      <w:r>
+        <w:rPr>
+          <w:rFonts w:ascii="Times New Roman" w:cs="Times New Roman" w:eastAsia="Times New Roman" w:hAnsi="Times New Roman"/>
+          <w:sz w:val="24"/>
+          <w:szCs w:val="24"/>
+        </w:rPr>
+        <w:t xml:space="preserve">NET-SOC occupations with ratings (Cronbach’s α = 0.88), and the composite ranks occupations plausibly: airline pilots, commercial pilots, locomotive engineers, and bus drivers score highest, while telemarketers, credit counselors, and door-to-door sales workers score lowest. The composite covers 763 six-digit SOC occupations.</w:t>
+      </w:r>
+    </w:p>
+    <w:p>
+      <w:pPr>
+        <w:spacing w:after="0" w:line="480" w:lineRule="auto"/>
+        <w:ind w:firstLine="720"/>
+        <w:jc w:val="left"/>
+      </w:pPr>
+      <w:r>
+        <w:rPr>
+          <w:rFonts w:ascii="Times New Roman" w:cs="Times New Roman" w:eastAsia="Times New Roman" w:hAnsi="Times New Roman"/>
+          <w:sz w:val="24"/>
+          <w:szCs w:val="24"/>
+        </w:rPr>
+        <w:t xml:space="preserve">We also compared the measures against human judgment. One coder rated a random sample of 200 O*NET task statements (0 = not dependent on visual perception, 1 = secondary, 2 = central). The human task rating correlates positively with the primary occupational measure (Spearman ρ = 0.43, n = 188 tasks with a matched occupation rating, 95% bootstrap interval 0.31 to 0.54), and mean occupational visual intensity rises monotonically across human ratings (0.27, 0.32, and 0.36 for ratings of 0, 1, and 2). The correlation is moderate rather than high, and it is bounded from above because the human rating is at the task level while the primary measure is at the occupation level.</w:t>
+      </w:r>
+    </w:p>
+    <w:p>
+      <w:pPr>
+        <w:spacing w:after="0" w:line="480" w:lineRule="auto"/>
+        <w:ind w:firstLine="720"/>
+        <w:jc w:val="left"/>
+      </w:pPr>
+      <w:r>
+        <w:rPr>
+          <w:rFonts w:ascii="Times New Roman" w:cs="Times New Roman" w:eastAsia="Times New Roman" w:hAnsi="Times New Roman"/>
+          <w:sz w:val="24"/>
+          <w:szCs w:val="24"/>
+        </w:rPr>
+        <w:t xml:space="preserve">The LLM-based task classification agreed only weakly with the human ratings on exact categories (Cohen’s κ between 0.19 and 0.23 for two models on 200 tasks; Spearman ρ with the human rating about 0.40), and a held-out test of a revised rubric with examples did not improve agreement (κ between 0.04 and 0.10 on the 100 held-out tasks). Because only one human coder was used, we cannot separate model error from disagreement among humans. For these reasons the LLM classification is used only as a secondary measure and as a robustness check, and a second human coder is planned to estimate inter-rater reliability.</w:t>
       </w:r>
     </w:p>
     <w:p>
@@ -2880,7 +3098,7 @@
           <w:sz w:val="24"/>
           <w:szCs w:val="24"/>
         </w:rPr>
-        <w:t xml:space="preserve"> We report inter-rater agreement for the task classification and show robustness to alternative exposure measures (for example, Webb 2020; Felten et al. 2021).</w:t>
+        <w:t xml:space="preserve"> Results are reported for the primary O*NET Abilities measure and for the secondary LLM-based task share. We report inter-rater agreement once a second human coder is available and show robustness to alternative exposure measures (for example, Webb 2020; Felten et al. 2021).</w:t>
       </w:r>
     </w:p>
     <w:p>
@@ -2981,7 +3199,7 @@
           <w:sz w:val="24"/>
           <w:szCs w:val="24"/>
         </w:rPr>
-        <w:t xml:space="preserve">. Validation will include inter-rater agreement between the LLM-assisted and human classifications of O*NET tasks, and the correlation of the adoption measure with vision-related patenting.</w:t>
+        <w:t xml:space="preserve">. Validation of the visual-intensity measure is reported in Section 4.3; the correlation of the adoption measure with vision-related patenting remains to be reported.</w:t>
       </w:r>
     </w:p>
     <w:p>
@@ -6226,7 +6444,7 @@
           <w:sz w:val="24"/>
           <w:szCs w:val="24"/>
         </w:rPr>
-        <w:t xml:space="preserve">Postings measure hiring intent rather than deployment, and vendor-supplied systems are invisible to our adoption measure, which biases estimates toward zero. Postings over-represent professional occupations despite reweighting. The adoption event is a choice, so staggered difference-in-differences identifies causal effects only under parallel-trend assumptions that we probe but cannot prove; the foundation-model shock is common to all firms and relies on cross-sectional variation in exposure. The LLM-assisted classification of visual intensity depends on prompt and model choices, which we address through validation and alternative measures. Finally, the break-even model is a stylized single-task model, and multi-task bundling of automation costs is left for future work.</w:t>
+        <w:t xml:space="preserve">Postings measure hiring intent rather than deployment, and vendor-supplied systems are invisible to our adoption measure, which biases estimates toward zero. Postings over-represent professional occupations despite reweighting. The adoption event is a choice, so staggered difference-in-differences identifies causal effects only under parallel-trend assumptions that we probe but cannot prove; the foundation-model shock is common to all firms and relies on cross-sectional variation in exposure. The primary visual-intensity measure is a composite of analyst ratings of visual abilities. It captures how much an occupation requires vision, not whether the visual tasks can be automated, and its correlation with human task ratings is moderate (Section 4.3). The secondary LLM-based classification depends on prompt and model choices and agreed only weakly with a single human coder. Finally, the break-even model is a stylized single-task model, and multi-task bundling of automation costs is left for future work.</w:t>
       </w:r>
     </w:p>
     <w:p>

</xml_diff>

<commit_message>
Treat multimodal LLMs as mechanism: multimodal foundation models, dual adoption measures, multiple shock dates
Co-Authored-By: Claude Sonnet 5.5 <noreply@anthropic.com>
Claude-Session: https://claude.ai/code/session_01H4JvRLBkzRHsy6jU5TcEWv
</commit_message>
<xml_diff>
--- a/isr_paper/ISR_Paper_AI_Vision_Fixed_Costs.docx
+++ b/isr_paper/ISR_Paper_AI_Vision_Fixed_Costs.docx
@@ -118,7 +118,7 @@
           <w:sz w:val="24"/>
           <w:szCs w:val="24"/>
         </w:rPr>
-        <w:t xml:space="preserve">Whether AI vision displaces workers depends less on what the technology can see than on whether automating a visual task covers a largely fixed cost. We develop a break-even model of automation in which a firm adopts computer vision only when its volume of visual tasks exceeds a threshold, and derive four testable predictions: adoption reduces demand for vision-intensive occupations, more so in firms with large visual task volumes; general-purpose vision foundation models lower the break-even scale and extend adoption to smaller firms; and adoption raises demand for complementary judgment, monitoring, and integration skills. We design a test using Lightcast online job postings for the United States, 2015–2025, measuring adoption from firms’ computer-vision skill requirements and occupational visual intensity from O*NET analyst ratings of visual abilities, and using staggered difference-in-differences and an event study around foundation-model releases, while separating vision effects from concurrent large language model effects. The paper moves research on AI and work from technical exposure to the economics of adoption.</w:t>
+        <w:t xml:space="preserve">Whether AI vision displaces workers depends less on what the technology can see than on whether automating a visual task covers a largely fixed cost. We model automation as a break-even problem and predict that vision adoption reduces demand for vision-intensive occupations, especially in firms with large visual task volumes; that multimodal foundation models, including multimodal large language models accessed through APIs, lower the break-even scale and extend adoption to smaller firms; and that adoption raises demand for complementary judgment, monitoring, and integration skills. We design tests using Lightcast U.S. online job postings, 2015–2025, with adoption measured from computer-vision skills and, separately, API-based multimodal AI skills, and visual intensity from O*NET ability ratings. Staggered difference-in-differences and event studies around successive model releases separate language-task effects from visual ones. The paper moves research on AI and work from exposure to adoption economics.</w:t>
       </w:r>
     </w:p>
     <w:p>
@@ -232,7 +232,7 @@
           <w:sz w:val="24"/>
           <w:szCs w:val="24"/>
         </w:rPr>
-        <w:t xml:space="preserve">Large pretrained vision and vision-language models, which we call vision foundation models, should move this threshold. By reducing the task-specific data and development effort required, and by spreading fixed costs across many customers through application programming interfaces (APIs), they lower the fixed cost of adopting vision for any single firm. If that is right, adoption should extend to smaller firms whose visual workloads were previously too small to justify a bespoke system. This is a diffusion claim as much as a labor claim, and it speaks directly to how platform-like layers of AI infrastructure reshape who can use AI.</w:t>
+        <w:t xml:space="preserve">Large pretrained vision and vision-language models, and more recently multimodal large language models (LLMs) that read images, should move this threshold. We call them multimodal foundation models. By reducing the task-specific data and development effort required, and by spreading fixed costs across many customers through application programming interfaces (APIs), they lower the fixed cost of adopting vision for any single firm. The spread of LLMs is therefore not only a confounder of AI vision adoption but plausibly one of its causes, and we treat it as part of the mechanism. If that is right, adoption should extend to smaller firms whose visual workloads were previously too small to justify a bespoke system. This is a diffusion claim as much as a labor claim, and it speaks directly to how platform-like layers of AI infrastructure reshape who can use AI.</w:t>
       </w:r>
     </w:p>
     <w:p>
@@ -301,7 +301,7 @@
           <w:sz w:val="24"/>
           <w:szCs w:val="24"/>
         </w:rPr>
-        <w:t xml:space="preserve"> Did the arrival of vision foundation models shift adoption toward smaller firms, consistent with a falling break-even scale?</w:t>
+        <w:t xml:space="preserve"> Did the arrival of multimodal foundation models, including multimodal LLMs, shift adoption toward smaller firms, consistent with a falling break-even scale?</w:t>
       </w:r>
     </w:p>
     <w:p>
@@ -316,7 +316,7 @@
           <w:sz w:val="24"/>
           <w:szCs w:val="24"/>
         </w:rPr>
-        <w:t xml:space="preserve">To answer them, we use Lightcast (formerly Burning Glass Technologies) online job postings for the United States from 2015 to 2025. Postings let us observe, at the firm-quarter level, both what a firm hires for and which technical skills it requires. We infer adoption of computer vision from the skills a firm begins to demand, measure the visual intensity of occupations from O</w:t>
+        <w:t xml:space="preserve">To answer them, we use Lightcast (formerly Burning Glass Technologies) online job postings for the United States from 2015 to 2025. Postings let us observe, at the firm-quarter level, both what a firm hires for and which technical skills it requires. We infer adoption from the skills a firm begins to demand, using one definition for traditional computer vision and a second for API-based multimodal AI, measure the visual intensity of occupations from O</w:t>
       </w:r>
       <w:r>
         <w:rPr>
@@ -334,7 +334,7 @@
           <w:sz w:val="24"/>
           <w:szCs w:val="24"/>
         </w:rPr>
-        <w:t xml:space="preserve">NET task statements as a secondary measure), and estimate (i) staggered difference-in-differences effects of adoption on demand for vision-intensive occupations and complementary skills, (ii) heterogeneity of these effects by pre-period task scale, and (iii) an event study around the release of general-purpose vision foundation models, estimated separately by firm size. Because vision foundation models diffused alongside large language models (LLMs), all specifications control for occupational exposure to LLMs.</w:t>
+        <w:t xml:space="preserve">NET task statements as a secondary measure), and estimate (i) staggered difference-in-differences effects of adoption on demand for vision-intensive occupations and complementary skills, (ii) heterogeneity of these effects by pre-period task scale, and (iii) event studies around successive releases of multimodal foundation models, estimated separately by firm size. Because multimodal LLMs both diffused alongside text-only LLMs and extended them to images, all specifications control for occupational exposure to language tasks, and we do not claim to separate vision-only models from multimodal LLMs.</w:t>
       </w:r>
     </w:p>
     <w:p>
@@ -788,7 +788,7 @@
           <w:sz w:val="24"/>
           <w:szCs w:val="24"/>
         </w:rPr>
-        <w:t xml:space="preserve">. Vision foundation models reduce task-specific data and development costs and are shared across many customers, so they lower </w:t>
+        <w:t xml:space="preserve">. Multimodal foundation models, from vision-language models to multimodal LLMs offered through APIs, reduce task-specific data and development costs and are shared across many customers, so they lower </w:t>
       </w:r>
       <w:r>
         <w:rPr>
@@ -1355,7 +1355,7 @@
                 <w:sz w:val="20"/>
                 <w:szCs w:val="20"/>
               </w:rPr>
-              <w:t xml:space="preserve">Foundation models lower the break-even scale of adoption.</w:t>
+              <w:t xml:space="preserve">Multimodal foundation models (vision-language models and multimodal LLMs accessed through APIs) lower the break-even scale of adoption.</w:t>
             </w:r>
           </w:p>
         </w:tc>
@@ -1387,7 +1387,7 @@
                 <w:sz w:val="20"/>
                 <w:szCs w:val="20"/>
               </w:rPr>
-              <w:t xml:space="preserve">After the shock, adoption rises most among smaller firms with high visual exposure.</w:t>
+              <w:t xml:space="preserve">After each release, adoption, measured both by traditional computer-vision skills and by API-based multimodal AI skills, rises most among smaller firms with high visual exposure.</w:t>
             </w:r>
           </w:p>
         </w:tc>
@@ -1595,15 +1595,33 @@
           <w:sz w:val="24"/>
           <w:szCs w:val="24"/>
         </w:rPr>
-        <w:t xml:space="preserve">Vision adoption</w:t>
-      </w:r>
-      <w:r>
-        <w:rPr>
-          <w:rFonts w:ascii="Times New Roman" w:cs="Times New Roman" w:eastAsia="Times New Roman" w:hAnsi="Times New Roman"/>
-          <w:sz w:val="24"/>
-          <w:szCs w:val="24"/>
-        </w:rPr>
-        <w:t xml:space="preserve"> is the first quarter in which postings requiring computer-vision skills (for example, computer vision, machine vision, image processing, object detection, image segmentation, OpenCV) exceed a threshold share of the firm’s postings; we vary the threshold in robustness checks, and exact skill names will be verified against the current Lightcast Open Skills taxonomy. </w:t>
+        <w:t xml:space="preserve">Vision adoption (CV)</w:t>
+      </w:r>
+      <w:r>
+        <w:rPr>
+          <w:rFonts w:ascii="Times New Roman" w:cs="Times New Roman" w:eastAsia="Times New Roman" w:hAnsi="Times New Roman"/>
+          <w:sz w:val="24"/>
+          <w:szCs w:val="24"/>
+        </w:rPr>
+        <w:t xml:space="preserve"> is the first quarter in which postings requiring computer-vision skills (for example, computer vision, machine vision, image processing, object detection, image segmentation, OpenCV) exceed a threshold share of the firm’s postings; we vary the threshold in robustness checks, and exact skill names will be verified against the current Lightcast Open Skills taxonomy. Because API-based use of multimodal models requires no computer-vision engineer, we also define </w:t>
+      </w:r>
+      <w:r>
+        <w:rPr>
+          <w:rFonts w:ascii="Times New Roman" w:cs="Times New Roman" w:eastAsia="Times New Roman" w:hAnsi="Times New Roman"/>
+          <w:i/>
+          <w:iCs/>
+          <w:sz w:val="24"/>
+          <w:szCs w:val="24"/>
+        </w:rPr>
+        <w:t xml:space="preserve">multimodal AI adoption (MM)</w:t>
+      </w:r>
+      <w:r>
+        <w:rPr>
+          <w:rFonts w:ascii="Times New Roman" w:cs="Times New Roman" w:eastAsia="Times New Roman" w:hAnsi="Times New Roman"/>
+          <w:sz w:val="24"/>
+          <w:szCs w:val="24"/>
+        </w:rPr>
+        <w:t xml:space="preserve"> as the first quarter in which postings requiring generative-AI, LLM, or foundation-model API skills exceed a threshold share. CV captures building or customizing vision systems, while MM captures buying general-purpose capability; neither alone measures AI vision use, so we report both. </w:t>
       </w:r>
       <w:r>
         <w:rPr>
@@ -1858,7 +1876,7 @@
                 <w:sz w:val="20"/>
                 <w:szCs w:val="20"/>
               </w:rPr>
-              <w:t xml:space="preserve">Vision adoption</w:t>
+              <w:t xml:space="preserve">Vision adoption (CV)</w:t>
             </w:r>
           </w:p>
         </w:tc>
@@ -1960,7 +1978,7 @@
                 <w:sz w:val="20"/>
                 <w:szCs w:val="20"/>
               </w:rPr>
-              <w:t xml:space="preserve">Occupational visual intensity (primary)</w:t>
+              <w:t xml:space="preserve">Multimodal AI adoption (MM)</w:t>
             </w:r>
           </w:p>
         </w:tc>
@@ -1992,7 +2010,7 @@
                 <w:sz w:val="20"/>
                 <w:szCs w:val="20"/>
               </w:rPr>
-              <w:t xml:space="preserve">Mean importance of seven O*NET visual abilities (near/far vision, color discrimination, night/peripheral vision, depth perception, glare sensitivity), rescaled to 0–1; SOC6 level.</w:t>
+              <w:t xml:space="preserve">Firm posts jobs requiring generative-AI, LLM, multimodal or foundation-model API skills (for example, prompt engineering, OpenAI API, multimodal models). Captures API-based use that needs no computer-vision engineer; a broad proxy, interpreted jointly with visual exposure.</w:t>
             </w:r>
           </w:p>
         </w:tc>
@@ -2024,7 +2042,7 @@
                 <w:sz w:val="20"/>
                 <w:szCs w:val="20"/>
               </w:rPr>
-              <w:t xml:space="preserve">O*NET Abilities</w:t>
+              <w:t xml:space="preserve">Lightcast skills taxonomy (names to be verified)</w:t>
             </w:r>
           </w:p>
         </w:tc>
@@ -2062,7 +2080,7 @@
                 <w:sz w:val="20"/>
                 <w:szCs w:val="20"/>
               </w:rPr>
-              <w:t xml:space="preserve">Visual task share (secondary)</w:t>
+              <w:t xml:space="preserve">Occupational visual intensity (primary)</w:t>
             </w:r>
           </w:p>
         </w:tc>
@@ -2094,7 +2112,7 @@
                 <w:sz w:val="20"/>
                 <w:szCs w:val="20"/>
               </w:rPr>
-              <w:t xml:space="preserve">Share of an occupation’s O*NET task statements that depend on visual perception, classified by an LLM.</w:t>
+              <w:t xml:space="preserve">Mean importance of seven O*NET visual abilities (near/far vision, color discrimination, night/peripheral vision, depth perception, glare sensitivity), rescaled to 0–1; SOC6 level.</w:t>
             </w:r>
           </w:p>
         </w:tc>
@@ -2126,7 +2144,7 @@
                 <w:sz w:val="20"/>
                 <w:szCs w:val="20"/>
               </w:rPr>
-              <w:t xml:space="preserve">O*NET task statements</w:t>
+              <w:t xml:space="preserve">O*NET Abilities</w:t>
             </w:r>
           </w:p>
         </w:tc>
@@ -2164,7 +2182,7 @@
                 <w:sz w:val="20"/>
                 <w:szCs w:val="20"/>
               </w:rPr>
-              <w:t xml:space="preserve">Firm visual exposure (VisExp)</w:t>
+              <w:t xml:space="preserve">Visual task share (secondary)</w:t>
             </w:r>
           </w:p>
         </w:tc>
@@ -2196,7 +2214,7 @@
                 <w:sz w:val="20"/>
                 <w:szCs w:val="20"/>
               </w:rPr>
-              <w:t xml:space="preserve">Posting-weighted average of primary occupational visual intensity in the pre-period (2015–2018).</w:t>
+              <w:t xml:space="preserve">Share of an occupation’s O*NET task statements that depend on visual perception, classified by an LLM.</w:t>
             </w:r>
           </w:p>
         </w:tc>
@@ -2228,7 +2246,7 @@
                 <w:sz w:val="20"/>
                 <w:szCs w:val="20"/>
               </w:rPr>
-              <w:t xml:space="preserve">Lightcast + O*NET</w:t>
+              <w:t xml:space="preserve">O*NET task statements</w:t>
             </w:r>
           </w:p>
         </w:tc>
@@ -2266,7 +2284,7 @@
                 <w:sz w:val="20"/>
                 <w:szCs w:val="20"/>
               </w:rPr>
-              <w:t xml:space="preserve">Firm language exposure (LangExp)</w:t>
+              <w:t xml:space="preserve">Firm visual exposure (VisExp)</w:t>
             </w:r>
           </w:p>
         </w:tc>
@@ -2298,7 +2316,7 @@
                 <w:sz w:val="20"/>
                 <w:szCs w:val="20"/>
               </w:rPr>
-              <w:t xml:space="preserve">Posting-weighted average of occupational exposure to large language models.</w:t>
+              <w:t xml:space="preserve">Posting-weighted average of primary occupational visual intensity in the pre-period (2015–2018).</w:t>
             </w:r>
           </w:p>
         </w:tc>
@@ -2330,7 +2348,7 @@
                 <w:sz w:val="20"/>
                 <w:szCs w:val="20"/>
               </w:rPr>
-              <w:t xml:space="preserve">Eloundou et al. (2023)</w:t>
+              <w:t xml:space="preserve">Lightcast + O*NET</w:t>
             </w:r>
           </w:p>
         </w:tc>
@@ -2368,7 +2386,7 @@
                 <w:sz w:val="20"/>
                 <w:szCs w:val="20"/>
               </w:rPr>
-              <w:t xml:space="preserve">Task scale</w:t>
+              <w:t xml:space="preserve">Firm language exposure (LangExp)</w:t>
             </w:r>
           </w:p>
         </w:tc>
@@ -2400,7 +2418,7 @@
                 <w:sz w:val="20"/>
                 <w:szCs w:val="20"/>
               </w:rPr>
-              <w:t xml:space="preserve">Pre-period count of postings in vision-intensive occupations; Compustat employment for the matched subsample.</w:t>
+              <w:t xml:space="preserve">Posting-weighted average of occupational exposure to large language models.</w:t>
             </w:r>
           </w:p>
         </w:tc>
@@ -2432,7 +2450,7 @@
                 <w:sz w:val="20"/>
                 <w:szCs w:val="20"/>
               </w:rPr>
-              <w:t xml:space="preserve">Lightcast, Compustat</w:t>
+              <w:t xml:space="preserve">Eloundou et al. (2023)</w:t>
             </w:r>
           </w:p>
         </w:tc>
@@ -2448,6 +2466,108 @@
             <w:tcBorders>
               <w:top w:val="none" w:color="FFFFFF" w:sz="0"/>
               <w:left w:val="none" w:color="FFFFFF" w:sz="0"/>
+              <w:bottom w:val="none" w:color="FFFFFF" w:sz="0"/>
+              <w:right w:val="none" w:color="FFFFFF" w:sz="0"/>
+            </w:tcBorders>
+            <w:tcMar>
+              <w:top w:type="dxa" w:w="50"/>
+              <w:left w:type="dxa" w:w="90"/>
+              <w:bottom w:type="dxa" w:w="50"/>
+              <w:right w:type="dxa" w:w="90"/>
+            </w:tcMar>
+          </w:tcPr>
+          <w:p>
+            <w:pPr>
+              <w:spacing w:line="240" w:lineRule="auto"/>
+            </w:pPr>
+            <w:r>
+              <w:rPr>
+                <w:rFonts w:ascii="Times New Roman" w:cs="Times New Roman" w:eastAsia="Times New Roman" w:hAnsi="Times New Roman"/>
+                <w:b w:val="false"/>
+                <w:bCs w:val="false"/>
+                <w:sz w:val="20"/>
+                <w:szCs w:val="20"/>
+              </w:rPr>
+              <w:t xml:space="preserve">Task scale</w:t>
+            </w:r>
+          </w:p>
+        </w:tc>
+        <w:tc>
+          <w:tcPr>
+            <w:tcW w:type="dxa" w:w="5560"/>
+            <w:tcBorders>
+              <w:top w:val="none" w:color="FFFFFF" w:sz="0"/>
+              <w:left w:val="none" w:color="FFFFFF" w:sz="0"/>
+              <w:bottom w:val="none" w:color="FFFFFF" w:sz="0"/>
+              <w:right w:val="none" w:color="FFFFFF" w:sz="0"/>
+            </w:tcBorders>
+            <w:tcMar>
+              <w:top w:type="dxa" w:w="50"/>
+              <w:left w:type="dxa" w:w="90"/>
+              <w:bottom w:type="dxa" w:w="50"/>
+              <w:right w:type="dxa" w:w="90"/>
+            </w:tcMar>
+          </w:tcPr>
+          <w:p>
+            <w:pPr>
+              <w:spacing w:line="240" w:lineRule="auto"/>
+            </w:pPr>
+            <w:r>
+              <w:rPr>
+                <w:rFonts w:ascii="Times New Roman" w:cs="Times New Roman" w:eastAsia="Times New Roman" w:hAnsi="Times New Roman"/>
+                <w:b w:val="false"/>
+                <w:bCs w:val="false"/>
+                <w:sz w:val="20"/>
+                <w:szCs w:val="20"/>
+              </w:rPr>
+              <w:t xml:space="preserve">Pre-period count of postings in vision-intensive occupations; Compustat employment for the matched subsample.</w:t>
+            </w:r>
+          </w:p>
+        </w:tc>
+        <w:tc>
+          <w:tcPr>
+            <w:tcW w:type="dxa" w:w="2100"/>
+            <w:tcBorders>
+              <w:top w:val="none" w:color="FFFFFF" w:sz="0"/>
+              <w:left w:val="none" w:color="FFFFFF" w:sz="0"/>
+              <w:bottom w:val="none" w:color="FFFFFF" w:sz="0"/>
+              <w:right w:val="none" w:color="FFFFFF" w:sz="0"/>
+            </w:tcBorders>
+            <w:tcMar>
+              <w:top w:type="dxa" w:w="50"/>
+              <w:left w:type="dxa" w:w="90"/>
+              <w:bottom w:type="dxa" w:w="50"/>
+              <w:right w:type="dxa" w:w="90"/>
+            </w:tcMar>
+          </w:tcPr>
+          <w:p>
+            <w:pPr>
+              <w:spacing w:line="240" w:lineRule="auto"/>
+            </w:pPr>
+            <w:r>
+              <w:rPr>
+                <w:rFonts w:ascii="Times New Roman" w:cs="Times New Roman" w:eastAsia="Times New Roman" w:hAnsi="Times New Roman"/>
+                <w:b w:val="false"/>
+                <w:bCs w:val="false"/>
+                <w:sz w:val="20"/>
+                <w:szCs w:val="20"/>
+              </w:rPr>
+              <w:t xml:space="preserve">Lightcast, Compustat</w:t>
+            </w:r>
+          </w:p>
+        </w:tc>
+      </w:tr>
+      <w:tr>
+        <w:trPr>
+          <w:cantSplit/>
+          <w:tblHeader w:val="false"/>
+        </w:trPr>
+        <w:tc>
+          <w:tcPr>
+            <w:tcW w:type="dxa" w:w="1700"/>
+            <w:tcBorders>
+              <w:top w:val="none" w:color="FFFFFF" w:sz="0"/>
+              <w:left w:val="none" w:color="FFFFFF" w:sz="0"/>
               <w:bottom w:val="single" w:color="000000" w:sz="4"/>
               <w:right w:val="none" w:color="FFFFFF" w:sz="0"/>
             </w:tcBorders>
@@ -2828,7 +2948,7 @@
           <w:sz w:val="24"/>
           <w:szCs w:val="24"/>
         </w:rPr>
-        <w:t xml:space="preserve"> are industry-by-quarter fixed effects. H1 predicts negative post-adoption coefficients </w:t>
+        <w:t xml:space="preserve"> are industry-by-quarter fixed effects. We estimate equation (2) with the CV adoption date as the treatment, and repeat it with the MM adoption date, which is interpreted as adoption of general-purpose AI by visually intensive firms rather than of vision specifically. H1 predicts negative post-adoption coefficients </w:t>
       </w:r>
       <w:r>
         <w:rPr>
@@ -2878,7 +2998,25 @@
           <w:sz w:val="24"/>
           <w:szCs w:val="24"/>
         </w:rPr>
-        <w:t xml:space="preserve">Adoption is itself endogenous, so for H3 we exploit the release of general-purpose vision foundation models as a common shock whose bite varies with firms’ pre-period visual exposure. Our primary shock date is 2023Q2, when promptable segmentation and vision-language models became broadly available; we use the 2021 release of contrastive image-text models as an alternative date. The event-study specification, estimated separately by firm size class, is:</w:t>
+        <w:t xml:space="preserve">Adoption is itself endogenous, so for H3 we exploit the successive releases of multimodal foundation models as common shocks whose bite varies with firms’ pre-period visual exposure. Because vision-only and multimodal LLM releases overlap in time, we estimate the event study separately for four dates rather than choosing one: the 2021 release of contrastive image-text models (2021Q1), the 2023Q2 release of promptable segmentation models, the 2023Q4 release of multimodal LLMs with image input, and the 2024Q2 release of faster, cheaper multimodal LLMs. Exact release dates will be verified. The first two are vision-specific and the last two are multimodal LLM releases that can be used through APIs. The dependent variable is each of the two adoption definitions in turn. The event-study specification for a shock at date </w:t>
+      </w:r>
+      <w:r>
+        <w:rPr>
+          <w:rFonts w:ascii="Times New Roman" w:cs="Times New Roman" w:eastAsia="Times New Roman" w:hAnsi="Times New Roman"/>
+          <w:i/>
+          <w:iCs/>
+          <w:sz w:val="24"/>
+          <w:szCs w:val="24"/>
+        </w:rPr>
+        <w:t xml:space="preserve">s</w:t>
+      </w:r>
+      <w:r>
+        <w:rPr>
+          <w:rFonts w:ascii="Times New Roman" w:cs="Times New Roman" w:eastAsia="Times New Roman" w:hAnsi="Times New Roman"/>
+          <w:sz w:val="24"/>
+          <w:szCs w:val="24"/>
+        </w:rPr>
+        <w:t xml:space="preserve">, estimated separately by firm size class, is:</w:t>
       </w:r>
     </w:p>
     <w:p>
@@ -2956,7 +3094,43 @@
           <w:sz w:val="24"/>
           <w:szCs w:val="24"/>
         </w:rPr>
-        <w:t xml:space="preserve"> with time absorbs the concurrent language-model shock.</w:t>
+        <w:t xml:space="preserve"> with time absorbs the effect of language-model capability on text-intensive firms. It does not absorb the effect of multimodal capability on visually intensive firms, which is part of what </w:t>
+      </w:r>
+      <w:r>
+        <w:rPr>
+          <w:rFonts w:ascii="Times New Roman" w:cs="Times New Roman" w:eastAsia="Times New Roman" w:hAnsi="Times New Roman"/>
+          <w:i/>
+          <w:iCs/>
+          <w:sz w:val="24"/>
+          <w:szCs w:val="24"/>
+        </w:rPr>
+        <w:t xml:space="preserve">δ_k</w:t>
+      </w:r>
+      <w:r>
+        <w:rPr>
+          <w:rFonts w:ascii="Times New Roman" w:cs="Times New Roman" w:eastAsia="Times New Roman" w:hAnsi="Times New Roman"/>
+          <w:sz w:val="24"/>
+          <w:szCs w:val="24"/>
+        </w:rPr>
+        <w:t xml:space="preserve"> captures by design. Comparing </w:t>
+      </w:r>
+      <w:r>
+        <w:rPr>
+          <w:rFonts w:ascii="Times New Roman" w:cs="Times New Roman" w:eastAsia="Times New Roman" w:hAnsi="Times New Roman"/>
+          <w:i/>
+          <w:iCs/>
+          <w:sz w:val="24"/>
+          <w:szCs w:val="24"/>
+        </w:rPr>
+        <w:t xml:space="preserve">δ_k</w:t>
+      </w:r>
+      <w:r>
+        <w:rPr>
+          <w:rFonts w:ascii="Times New Roman" w:cs="Times New Roman" w:eastAsia="Times New Roman" w:hAnsi="Times New Roman"/>
+          <w:sz w:val="24"/>
+          <w:szCs w:val="24"/>
+        </w:rPr>
+        <w:t xml:space="preserve"> across the four dates, and between the CV and MM outcomes, shows whether the response comes earlier and for different firms after vision-specific releases or after multimodal LLM releases. If small-firm adoption responds only on the MM outcome after the LLM releases, the break-even scale fell through API access rather than through vision-specific tooling.</w:t>
       </w:r>
     </w:p>
     <w:p>
@@ -2990,15 +3164,40 @@
           <w:sz w:val="24"/>
           <w:szCs w:val="24"/>
         </w:rPr>
-        <w:t xml:space="preserve">Concurrent LLM shock.</w:t>
-      </w:r>
-      <w:r>
-        <w:rPr>
-          <w:rFonts w:ascii="Times New Roman" w:cs="Times New Roman" w:eastAsia="Times New Roman" w:hAnsi="Times New Roman"/>
-          <w:sz w:val="24"/>
-          <w:szCs w:val="24"/>
-        </w:rPr>
-        <w:t xml:space="preserve"> Vision foundation models diffused alongside LLMs. Beyond the language-exposure control, we compare occupations with similar language exposure but different visual intensity.</w:t>
+        <w:t xml:space="preserve">Multimodal LLMs as mechanism and confound.</w:t>
+      </w:r>
+      <w:r>
+        <w:rPr>
+          <w:rFonts w:ascii="Times New Roman" w:cs="Times New Roman" w:eastAsia="Times New Roman" w:hAnsi="Times New Roman"/>
+          <w:sz w:val="24"/>
+          <w:szCs w:val="24"/>
+        </w:rPr>
+        <w:t xml:space="preserve"> The spread of LLMs with image understanding is plausibly a main driver of AI vision adoption after 2023, so we do not treat it as a nuisance shock. Controlling for language-task exposure removes the text channel only. We cannot cleanly separate vision-only models from multimodal LLMs, and we do not claim to; we instead report results by release date and by adoption definition, and compare occupations with similar language exposure but different visual intensity.</w:t>
+      </w:r>
+    </w:p>
+    <w:p>
+      <w:pPr>
+        <w:spacing w:after="0" w:line="480" w:lineRule="auto"/>
+        <w:ind w:firstLine="720"/>
+        <w:jc w:val="left"/>
+      </w:pPr>
+      <w:r>
+        <w:rPr>
+          <w:rFonts w:ascii="Times New Roman" w:cs="Times New Roman" w:eastAsia="Times New Roman" w:hAnsi="Times New Roman"/>
+          <w:b/>
+          <w:bCs/>
+          <w:sz w:val="24"/>
+          <w:szCs w:val="24"/>
+        </w:rPr>
+        <w:t xml:space="preserve">Adoption measure shifts with the technology.</w:t>
+      </w:r>
+      <w:r>
+        <w:rPr>
+          <w:rFonts w:ascii="Times New Roman" w:cs="Times New Roman" w:eastAsia="Times New Roman" w:hAnsi="Times New Roman"/>
+          <w:sz w:val="24"/>
+          <w:szCs w:val="24"/>
+        </w:rPr>
+        <w:t xml:space="preserve"> API-based use of a multimodal LLM requires no computer-vision engineer, so CV skill postings can understate adoption after 2023, most for small firms that buy rather than build. This would bias the CV-based test of H3 against finding small-firm adoption. We therefore define a second, API-based adoption measure, report both, and validate each against public disclosures and patents where available. The MM measure is broad: LLM skills do not imply vision use, so it is interpreted only jointly with visual exposure.</w:t>
       </w:r>
     </w:p>
     <w:p>
@@ -5555,7 +5754,7 @@
           <w:sz w:val="24"/>
           <w:szCs w:val="24"/>
         </w:rPr>
-        <w:t xml:space="preserve">We will estimate equation (3) separately by firm size class and plot </w:t>
+        <w:t xml:space="preserve">We will estimate equation (3) separately by firm size class, for each of the four release dates and for both adoption definitions, and plot </w:t>
       </w:r>
       <w:r>
         <w:rPr>
@@ -5573,7 +5772,7 @@
           <w:sz w:val="24"/>
           <w:szCs w:val="24"/>
         </w:rPr>
-        <w:t xml:space="preserve"> with confidence intervals. H3 is supported if pre-shock coefficients are statistically indistinguishable from zero and post-shock coefficients are positive and larger for smaller size classes, both for the 2023Q2 date and for the 2021 alternative date.</w:t>
+        <w:t xml:space="preserve"> with confidence intervals. H3 is supported if pre-shock coefficients are statistically indistinguishable from zero and post-shock coefficients are positive and larger for smaller size classes for at least the multimodal LLM releases on the MM outcome. We will report which date and adoption definition drives any effect, and will not describe a result as specific to vision-only models unless it holds for the vision-specific dates on the CV outcome.</w:t>
       </w:r>
     </w:p>
     <w:p>
@@ -5720,7 +5919,7 @@
                 <w:sz w:val="20"/>
                 <w:szCs w:val="20"/>
               </w:rPr>
-              <w:t xml:space="preserve">Mean post δ (2023Q2)</w:t>
+              <w:t xml:space="preserve">Mean post δ, CV adoption (by date)</w:t>
             </w:r>
           </w:p>
         </w:tc>
@@ -5753,7 +5952,7 @@
                 <w:sz w:val="20"/>
                 <w:szCs w:val="20"/>
               </w:rPr>
-              <w:t xml:space="preserve">Mean post δ (2021 alt.)</w:t>
+              <w:t xml:space="preserve">Mean post δ, MM adoption (by date)</w:t>
             </w:r>
           </w:p>
         </w:tc>
@@ -6380,7 +6579,7 @@
           <w:sz w:val="24"/>
           <w:szCs w:val="24"/>
         </w:rPr>
-        <w:t xml:space="preserve">The study is designed to make three contributions. By testing a break-even prediction with observed adoption, it shifts evidence on AI and work from what the technology can do to what firms find worthwhile to automate. By tracing which skills rise alongside vision adoption, it informs the IT business value literature on the complementary assets through which AI creates value. By comparing adoption before and after foundation models across firm sizes, it provides evidence on how a platform-like AI layer redistributes access to AI capabilities. Which of these contributions is realized depends on the estimates, and the discussion will be written accordingly once results are available.</w:t>
+        <w:t xml:space="preserve">The study is designed to make three contributions. By testing a break-even prediction with observed adoption, it shifts evidence on AI and work from what the technology can do to what firms find worthwhile to automate. By tracing which skills rise alongside vision adoption, it informs the IT business value literature on the complementary assets through which AI creates value. By comparing adoption before and after successive multimodal foundation-model releases across firm sizes, it provides evidence on how a platform-like AI layer redistributes access to AI capabilities. Which of these contributions is realized depends on the estimates, and the discussion will be written accordingly once results are available.</w:t>
       </w:r>
     </w:p>
     <w:p>
@@ -6444,7 +6643,7 @@
           <w:sz w:val="24"/>
           <w:szCs w:val="24"/>
         </w:rPr>
-        <w:t xml:space="preserve">Postings measure hiring intent rather than deployment, and vendor-supplied systems are invisible to our adoption measure, which biases estimates toward zero. Postings over-represent professional occupations despite reweighting. The adoption event is a choice, so staggered difference-in-differences identifies causal effects only under parallel-trend assumptions that we probe but cannot prove; the foundation-model shock is common to all firms and relies on cross-sectional variation in exposure. The primary visual-intensity measure is a composite of analyst ratings of visual abilities. It captures how much an occupation requires vision, not whether the visual tasks can be automated, and its correlation with human task ratings is moderate (Section 4.3). The secondary LLM-based classification depends on prompt and model choices and agreed only weakly with a single human coder. Finally, the break-even model is a stylized single-task model, and multi-task bundling of automation costs is left for future work.</w:t>
+        <w:t xml:space="preserve">Postings measure hiring intent rather than deployment, and vendor-supplied and API-based systems are only partly visible to our adoption measures, which biases estimates toward zero and, for the CV measure, understates adoption by small firms after multimodal LLMs arrived. We cannot separate the effect of vision-only models from that of multimodal LLMs, and the MM measure is a broad proxy that does not by itself indicate vision use. Postings over-represent professional occupations despite reweighting. The adoption event is a choice, so staggered difference-in-differences identifies causal effects only under parallel-trend assumptions that we probe but cannot prove; the foundation-model shock is common to all firms and relies on cross-sectional variation in exposure. The primary visual-intensity measure is a composite of analyst ratings of visual abilities. It captures how much an occupation requires vision, not whether the visual tasks can be automated, and its correlation with human task ratings is moderate (Section 4.3). The secondary LLM-based classification depends on prompt and model choices and agreed only weakly with a single human coder. Finally, the break-even model is a stylized single-task model, and multi-task bundling of automation costs is left for future work.</w:t>
       </w:r>
     </w:p>
     <w:p>
@@ -6477,7 +6676,7 @@
           <w:sz w:val="24"/>
           <w:szCs w:val="24"/>
         </w:rPr>
-        <w:t xml:space="preserve">Exposure shows what AI could do; fixed costs determine what firms do. By modeling vision automation as a break-even problem and testing it in firm-level hiring data around the arrival of vision foundation models, this paper aims to show whether the diffusion of AI vision is governed by scale economics, and whether platform-like AI infrastructure lowers the scale at which adoption pays.</w:t>
+        <w:t xml:space="preserve">Exposure shows what AI could do; fixed costs determine what firms do. By modeling vision automation as a break-even problem and testing it in firm-level hiring data around the arrival of multimodal foundation models, including multimodal LLMs, this paper aims to show whether the diffusion of AI vision is governed by scale economics, and whether platform-like AI infrastructure lowers the scale at which adoption pays.</w:t>
       </w:r>
     </w:p>
     <w:p>

</xml_diff>